<commit_message>
Finalize manuscript outputs: Table 3, Table 4, Table S1, pooled meta
Checkpoint of the state the finished manuscript was written against.

- Add scripts/table3_gapmap.py, table4_ae_safety.py, table_s1_references.py
  and pooled_meta.py, plus their outputs in tables/.
- Rename the observational AE table to ae_events_observational.csv so the two
  pipelines' event files are distinguishable where table4_ae_safety.py joins
  them.
- Add observational_studies/overrides.json and the Noller ibogaine PDF.
- Refresh all condition tables, figures and cleaned datasets from the current
  clinical_master.csv, and apply the Prior 2014 removal to the manuscript.
</commit_message>
<xml_diff>
--- a/tables/Alcohol_Descriptive_Analyses.docx
+++ b/tables/Alcohol_Descriptive_Analyses.docx
@@ -7401,7 +7401,7 @@
                 <w:i w:val="0"/>
                 <w:sz w:val="20"/>
               </w:rPr>
-              <w:t xml:space="preserve">    Baseline severity reported</w:t>
+              <w:t xml:space="preserve">    Baseline status reported</w:t>
             </w:r>
           </w:p>
         </w:tc>
@@ -7421,7 +7421,7 @@
               <w:bottom w:w="80" w:type="dxa"/>
               <w:right w:w="120" w:type="dxa"/>
             </w:tcMar>
-            <w:shd w:val="clear" w:color="auto" w:fill="D3E68C"/>
+            <w:shd w:val="clear" w:color="auto" w:fill="93E68C"/>
           </w:tcPr>
           <w:p>
             <w:pPr>
@@ -7435,7 +7435,7 @@
                 <w:i w:val="0"/>
                 <w:sz w:val="20"/>
               </w:rPr>
-              <w:t>69%</w:t>
+              <w:t>97%</w:t>
             </w:r>
           </w:p>
         </w:tc>

</xml_diff>